<commit_message>
RP 7.8: remove sustainability-quality comparison, record D020 cessation in July 2025
Drops section 3.5 (EEA+I vs quality KPIs), Figure 2 and the related
trade-off row and conclusions. D020 is now described as operating until
July 2025, when it ceased activity for conversion to a logistics hub:
its 2025 extensive quantities are excluded from variation comparisons.

Co-Authored-By: Claude Opus 5.5 <noreply@anthropic.com>
Claude-Session: https://claude.ai/code/session_01T1dLZLyj2dv3qbNVGGafpd
</commit_message>
<xml_diff>
--- a/RP 7.8 Report di collaudo della Intelligent Industry.docx
+++ b/RP 7.8 Report di collaudo della Intelligent Industry.docx
@@ -499,7 +499,7 @@
         <w:rPr>
           <w:i w:val="0"/>
         </w:rPr>
-        <w:t>L’attività si propone quattro scopi. Verificare che la catena di calcolo degli indici, eseguita nell’ambiente integrato della Intelligent Industry, riproduca i risultati validati negli OR 7.3 e 7.4. Osservare i due indici lungo la serie disponibile e verificarne l’andamento rispetto alla baseline. Verificare la conformità del sistema alle specifiche progettuali, alla normativa di prodotto e ai requisiti di governo del dato. Leggere infine gli indici di sostenibilità insieme agli indicatori di qualità dell’OR 7.5, cioè mettere alla prova proprio l’integrazione fra fabbrica e organizzazione che qualifica la Intelligent Industry.</w:t>
+        <w:t>L’attività si propone tre scopi. Verificare che la catena di calcolo degli indici, eseguita nell’ambiente integrato della Intelligent Industry, riproduca i risultati validati negli OR 7.3 e 7.4. Osservare i due indici lungo la serie disponibile e verificarne l’andamento rispetto alla baseline. Verificare la conformità del sistema alle specifiche progettuali, alla normativa di prodotto e ai requisiti di governo del dato, compresa l’integrazione fra fabbrica e organizzazione che qualifica la Intelligent Industry.</w:t>
       </w:r>
     </w:p>
     <w:p>
@@ -521,7 +521,7 @@
         <w:rPr>
           <w:i w:val="0"/>
         </w:rPr>
-        <w:t>Il perimetro comprende le tre unità produttive del Gruppo: D020 (Viano, MTO), D060 (Scandiano, ibrida MTS+MTO, sede del reparto di preparazione dell’impasto atomizzato) e D240 (Frassinoro, MTO). Il collaudo è condotto sulle serie annuali 2023–2025, con il 2022 come anno di riferimento per le differenze dei moduli EEA+, coerentemente con l’OR 7.3. Sul versante del prodotto il perimetro è quello delle tre tipologie dell’OR 7.4, definite dalle EPD di Gruppo: T1 (7,4 mm, D060), T2 (8,2 mm, D060) e T3 (20 mm, D240). Gli indicatori di qualità sono quelli dell’OR 7.5, sulle medesime unità e sui medesimi anni.</w:t>
+        <w:t>Il perimetro comprende le tre unità produttive del Gruppo: D020 (Viano, MTO), D060 (Scandiano, ibrida MTS+MTO, sede del reparto di preparazione dell’impasto atomizzato) e D240 (Frassinoro, MTO). Il collaudo è condotto sulle serie annuali 2023–2025, con il 2022 come anno di riferimento per le differenze dei moduli EEA+, coerentemente con l’OR 7.3. Sul versante del prodotto il perimetro è quello delle tre tipologie dell’OR 7.4, definite dalle EPD di Gruppo: T1 (7,4 mm, D060), T2 (8,2 mm, D060) e T3 (20 mm, D240). La conformità normativa di prodotto è letta anche attraverso il Right First Time dell’OR 7.5.</w:t>
       </w:r>
     </w:p>
     <w:p>
@@ -532,7 +532,18 @@
         <w:rPr>
           <w:i w:val="0"/>
         </w:rPr>
-        <w:t>Il Piano prevedeva un monitoraggio minimo di sei mesi, con un buffer di ulteriori sei mesi a fronte del rischio che il primo periodo non fosse sufficiente (problema progettuale n. 8); il KPI fissa l’obiettivo a dodici mesi. L’adozione di serie annuali complete assorbe entrambe le soglie: ogni valore annuale dell’EEA+I copre dodici mesi di produzione, e la serie triennale ne copre trentasei, assicurando la rappresentatività di tutte le tipologie produttive per colore, formato e spessore che il Piano richiede. Per l’unità D020, riconvertita a polo logistico nel corso del 2025 (OR 7.5), il valore 2025 della serie EEA+ è quello della serie provvisoria dell’OR 7.3 e sarà riallineato in sede di consolidamento.</w:t>
+        <w:t>Il Piano prevedeva un monitoraggio minimo di sei mesi, con un buffer di ulteriori sei mesi a fronte del rischio che il primo periodo non fosse sufficiente (problema progettuale n. 8); il KPI fissa l’obiettivo a dodici mesi. L’adozione di serie annuali complete assorbe entrambe le soglie: ogni valore annuale dell’EEA+I copre dodici mesi di produzione, e la serie triennale ne copre trentasei, assicurando la rappresentatività di tutte le tipologie produttive per colore, formato e spessore che il Piano richiede.</w:t>
+      </w:r>
+    </w:p>
+    <w:p>
+      <w:pPr>
+        <w:pStyle w:val="3RELTestoBase"/>
+      </w:pPr>
+      <w:r>
+        <w:rPr>
+          <w:i w:val="0"/>
+        </w:rPr>
+        <w:t>L’unità D020 ha operato come unità produttiva per una parte del 2025 e ha cessato le attività nel luglio 2025 per procedere alla riconversione a polo logistico. Il suo valore 2025 si riferisce quindi a un periodo di esercizio parziale. Poiché l’EEA+I è un indice intensivo, costruito come rapporto fra Sustainability Accounting ed exergia di riferimento e fra exergia utile ed exergia di riferimento, il valore resta confrontabile con quelli degli anni precedenti e delle altre unità. Le grandezze estensive di D020 per il 2025 (exergia di riferimento, contributi dei moduli) non sono invece confrontabili con quelle degli anni di esercizio completo e non sono impiegate nei confronti di variazione. Dal 2026 il perimetro produttivo del Gruppo comprende le unità D060 e D240.</w:t>
       </w:r>
     </w:p>
     <w:p>
@@ -900,7 +911,7 @@
         <w:rPr>
           <w:i w:val="0"/>
         </w:rPr>
-        <w:t>La trade-off analysis verifica che le decisioni rese possibili dal sistema restino leggibili quando gli obiettivi entrano in tensione. Sono esaminati quattro confronti: il bilanciamento fra score multidimensionale ed efficienza exergetica (α/β) e la ponderazione AHP nell’EEA+; il confronto fra tipologie di prodotto nel P-TSA al variare della priorità strategica; il confronto fra resa volumetrica e diffusione del declassamento fra unità produttive; il confronto, centrale per il collaudo, fra andamento degli indici di sostenibilità e andamento degli indicatori di qualità.</w:t>
+        <w:t>La trade-off analysis verifica che le decisioni rese possibili dal sistema restino leggibili quando gli obiettivi entrano in tensione. Sono esaminati tre confronti: il bilanciamento fra score multidimensionale ed efficienza exergetica (α/β) e la ponderazione AHP nell’EEA+; il confronto fra tipologie di prodotto nel P-TSA al variare della priorità strategica; il confronto fra resa volumetrica e diffusione del declassamento fra unità produttive.</w:t>
       </w:r>
     </w:p>
     <w:p>
@@ -944,7 +955,7 @@
         <w:rPr>
           <w:i w:val="0"/>
         </w:rPr>
-        <w:t>Seguono la verifica di riproducibilità della catena di calcolo, l’osservazione dei due indici sulla serie, la lettura integrata con gli indicatori di qualità, gli esiti della compliance analysis e della trade-off analysis e la verifica dei KPI di attività.</w:t>
+        <w:t>Seguono la verifica di riproducibilità della catena di calcolo, l’osservazione dei due indici sulla serie, gli esiti della compliance analysis e della trade-off analysis e la verifica dei KPI di attività.</w:t>
       </w:r>
     </w:p>
     <w:p>
@@ -2538,7 +2549,7 @@
         <w:rPr>
           <w:i w:val="0"/>
         </w:rPr>
-        <w:t>La scomposizione di TSI_abs nelle sue due componenti mostra da dove proviene il miglioramento (Tabella 4). L’efficienza exergetica Ψ cresce in modo regolare, di circa un punto percentuale in due anni in ciascuna unità; l’exergia di riferimento complessiva del Gruppo scende del 5,8 per cento fra il 2023 e il 2025, da 751.550 a 708.200 GJ, a parità di produzione dichiarata. Lo score multidimensionale Φ cresce invece da 0,019 a circa 0,072 e spiega fra l’84 e l’87 per cento dell’incremento di TSI_abs nelle tre unità.</w:t>
+        <w:t>La scomposizione di TSI_abs nelle sue due componenti mostra da dove proviene il miglioramento (Tabella 4). L’efficienza exergetica Ψ cresce in modo regolare, di circa un punto percentuale in due anni in ciascuna unità; l’exergia di riferimento scende fra il 2023 e il 2025 del 6,1 per cento in D060 e del 5,3 per cento in D240, le due unità con esercizio completo nell’intero periodo. Lo score multidimensionale Φ cresce invece da 0,019 a circa 0,072 e spiega fra l’84 e l’87 per cento dell’incremento di TSI_abs nelle tre unità.</w:t>
       </w:r>
     </w:p>
     <w:tbl>
@@ -2798,7 +2809,7 @@
               <w:rPr>
                 <w:sz w:val="18"/>
               </w:rPr>
-              <w:t>−5,8 %</w:t>
+              <w:t>n.c.¹</w:t>
             </w:r>
           </w:p>
         </w:tc>
@@ -3074,6 +3085,16 @@
           <w:sz w:val="18"/>
         </w:rPr>
         <w:t>Tabella 4. Componenti dell’EEA+ Index: score multidimensionale Φ, efficienza exergetica Ψ, variazione dell’exergia di riferimento e quota dell’incremento di TSI_abs attribuibile a Φ.</w:t>
+      </w:r>
+    </w:p>
+    <w:p>
+      <w:pPr/>
+      <w:r>
+        <w:rPr>
+          <w:i/>
+          <w:sz w:val="16"/>
+        </w:rPr>
+        <w:t>¹ Non confrontabile: nel 2025 l’unità D020 ha operato fino a luglio (§ 1.3).</w:t>
       </w:r>
     </w:p>
     <w:p>
@@ -3591,566 +3612,7 @@
         <w:rPr>
           <w:i w:val="0"/>
         </w:rPr>
-        <w:t>3.5 Lettura integrata fra fabbrica e organizzazione</w:t>
-      </w:r>
-    </w:p>
-    <w:p>
-      <w:pPr>
-        <w:pStyle w:val="3RELTestoBase"/>
-      </w:pPr>
-      <w:r>
-        <w:rPr>
-          <w:i w:val="0"/>
-        </w:rPr>
-        <w:t>La Intelligent Industry si distingue dalla Intelligent Factory perché la direzione legge sulla stessa base informativa ciò che la fabbrica produce, a quale costo termodinamico e con quale qualità. Il collaudo ha quindi affiancato l’EEA+I agli indicatori di qualità dell’OR 7.5 sulle stesse unità e sugli stessi anni (Tabella 6, Figura 2).</w:t>
-      </w:r>
-    </w:p>
-    <w:tbl>
-      <w:tblPr>
-        <w:tblStyle w:val="Grigliatabella"/>
-        <w:tblW w:type="auto" w:w="0"/>
-        <w:jc w:val="center"/>
-        <w:tblLook w:firstColumn="1" w:firstRow="1" w:lastColumn="0" w:lastRow="0" w:noHBand="0" w:noVBand="1" w:val="04A0"/>
-      </w:tblPr>
-      <w:tblGrid>
-        <w:gridCol w:w="1795"/>
-        <w:gridCol w:w="1795"/>
-        <w:gridCol w:w="1795"/>
-        <w:gridCol w:w="1795"/>
-        <w:gridCol w:w="1795"/>
-        <w:gridCol w:w="1795"/>
-      </w:tblGrid>
-      <w:tr>
-        <w:tc>
-          <w:tcPr>
-            <w:tcW w:type="dxa" w:w="1020"/>
-            <w:shd w:val="clear" w:color="auto" w:fill="024C41"/>
-          </w:tcPr>
-          <w:p>
-            <w:pPr>
-              <w:jc w:val="center"/>
-            </w:pPr>
-            <w:r/>
-            <w:r>
-              <w:rPr>
-                <w:b/>
-                <w:color w:val="FFFFFF"/>
-                <w:sz w:val="18"/>
-              </w:rPr>
-              <w:t>Anno</w:t>
-            </w:r>
-          </w:p>
-        </w:tc>
-        <w:tc>
-          <w:tcPr>
-            <w:tcW w:type="dxa" w:w="1474"/>
-            <w:shd w:val="clear" w:color="auto" w:fill="024C41"/>
-          </w:tcPr>
-          <w:p>
-            <w:pPr>
-              <w:jc w:val="center"/>
-            </w:pPr>
-            <w:r/>
-            <w:r>
-              <w:rPr>
-                <w:b/>
-                <w:color w:val="FFFFFF"/>
-                <w:sz w:val="18"/>
-              </w:rPr>
-              <w:t>EEA+I Gruppo</w:t>
-            </w:r>
-          </w:p>
-        </w:tc>
-        <w:tc>
-          <w:tcPr>
-            <w:tcW w:type="dxa" w:w="1701"/>
-            <w:shd w:val="clear" w:color="auto" w:fill="024C41"/>
-          </w:tcPr>
-          <w:p>
-            <w:pPr>
-              <w:jc w:val="center"/>
-            </w:pPr>
-            <w:r/>
-            <w:r>
-              <w:rPr>
-                <w:b/>
-                <w:color w:val="FFFFFF"/>
-                <w:sz w:val="18"/>
-              </w:rPr>
-              <w:t>Right First Time (%)</w:t>
-            </w:r>
-          </w:p>
-        </w:tc>
-        <w:tc>
-          <w:tcPr>
-            <w:tcW w:type="dxa" w:w="1814"/>
-            <w:shd w:val="clear" w:color="auto" w:fill="024C41"/>
-          </w:tcPr>
-          <w:p>
-            <w:pPr>
-              <w:jc w:val="center"/>
-            </w:pPr>
-            <w:r/>
-            <w:r>
-              <w:rPr>
-                <w:b/>
-                <w:color w:val="FFFFFF"/>
-                <w:sz w:val="18"/>
-              </w:rPr>
-              <w:t>Inspection Pass Rate (%)</w:t>
-            </w:r>
-          </w:p>
-        </w:tc>
-        <w:tc>
-          <w:tcPr>
-            <w:tcW w:type="dxa" w:w="1701"/>
-            <w:shd w:val="clear" w:color="auto" w:fill="024C41"/>
-          </w:tcPr>
-          <w:p>
-            <w:pPr>
-              <w:jc w:val="center"/>
-            </w:pPr>
-            <w:r/>
-            <w:r>
-              <w:rPr>
-                <w:b/>
-                <w:color w:val="FFFFFF"/>
-                <w:sz w:val="18"/>
-              </w:rPr>
-              <w:t>Defect Rate 1 % (%)</w:t>
-            </w:r>
-          </w:p>
-        </w:tc>
-        <w:tc>
-          <w:tcPr>
-            <w:tcW w:type="dxa" w:w="1701"/>
-            <w:shd w:val="clear" w:color="auto" w:fill="024C41"/>
-          </w:tcPr>
-          <w:p>
-            <w:pPr>
-              <w:jc w:val="center"/>
-            </w:pPr>
-            <w:r/>
-            <w:r>
-              <w:rPr>
-                <w:b/>
-                <w:color w:val="FFFFFF"/>
-                <w:sz w:val="18"/>
-              </w:rPr>
-              <w:t>Defect Rate 5 % (%)</w:t>
-            </w:r>
-          </w:p>
-        </w:tc>
-      </w:tr>
-      <w:tr>
-        <w:tc>
-          <w:tcPr>
-            <w:tcW w:type="dxa" w:w="1020"/>
-          </w:tcPr>
-          <w:p>
-            <w:pPr>
-              <w:jc w:val="left"/>
-            </w:pPr>
-            <w:r/>
-            <w:r>
-              <w:rPr>
-                <w:sz w:val="18"/>
-              </w:rPr>
-              <w:t>2023</w:t>
-            </w:r>
-          </w:p>
-        </w:tc>
-        <w:tc>
-          <w:tcPr>
-            <w:tcW w:type="dxa" w:w="1474"/>
-          </w:tcPr>
-          <w:p>
-            <w:pPr>
-              <w:jc w:val="center"/>
-            </w:pPr>
-            <w:r/>
-            <w:r>
-              <w:rPr>
-                <w:sz w:val="18"/>
-              </w:rPr>
-              <w:t>0,0909</w:t>
-            </w:r>
-          </w:p>
-        </w:tc>
-        <w:tc>
-          <w:tcPr>
-            <w:tcW w:type="dxa" w:w="1701"/>
-          </w:tcPr>
-          <w:p>
-            <w:pPr>
-              <w:jc w:val="center"/>
-            </w:pPr>
-            <w:r/>
-            <w:r>
-              <w:rPr>
-                <w:sz w:val="18"/>
-              </w:rPr>
-              <w:t>98,62</w:t>
-            </w:r>
-          </w:p>
-        </w:tc>
-        <w:tc>
-          <w:tcPr>
-            <w:tcW w:type="dxa" w:w="1814"/>
-          </w:tcPr>
-          <w:p>
-            <w:pPr>
-              <w:jc w:val="center"/>
-            </w:pPr>
-            <w:r/>
-            <w:r>
-              <w:rPr>
-                <w:sz w:val="18"/>
-              </w:rPr>
-              <w:t>98,56</w:t>
-            </w:r>
-          </w:p>
-        </w:tc>
-        <w:tc>
-          <w:tcPr>
-            <w:tcW w:type="dxa" w:w="1701"/>
-          </w:tcPr>
-          <w:p>
-            <w:pPr>
-              <w:jc w:val="center"/>
-            </w:pPr>
-            <w:r/>
-            <w:r>
-              <w:rPr>
-                <w:sz w:val="18"/>
-              </w:rPr>
-              <w:t>41,48</w:t>
-            </w:r>
-          </w:p>
-        </w:tc>
-        <w:tc>
-          <w:tcPr>
-            <w:tcW w:type="dxa" w:w="1701"/>
-          </w:tcPr>
-          <w:p>
-            <w:pPr>
-              <w:jc w:val="center"/>
-            </w:pPr>
-            <w:r/>
-            <w:r>
-              <w:rPr>
-                <w:sz w:val="18"/>
-              </w:rPr>
-              <w:t>16,76</w:t>
-            </w:r>
-          </w:p>
-        </w:tc>
-      </w:tr>
-      <w:tr>
-        <w:tc>
-          <w:tcPr>
-            <w:tcW w:type="dxa" w:w="1020"/>
-          </w:tcPr>
-          <w:p>
-            <w:pPr>
-              <w:jc w:val="left"/>
-            </w:pPr>
-            <w:r/>
-            <w:r>
-              <w:rPr>
-                <w:sz w:val="18"/>
-              </w:rPr>
-              <w:t>2024</w:t>
-            </w:r>
-          </w:p>
-        </w:tc>
-        <w:tc>
-          <w:tcPr>
-            <w:tcW w:type="dxa" w:w="1474"/>
-          </w:tcPr>
-          <w:p>
-            <w:pPr>
-              <w:jc w:val="center"/>
-            </w:pPr>
-            <w:r/>
-            <w:r>
-              <w:rPr>
-                <w:sz w:val="18"/>
-              </w:rPr>
-              <w:t>0,1060</w:t>
-            </w:r>
-          </w:p>
-        </w:tc>
-        <w:tc>
-          <w:tcPr>
-            <w:tcW w:type="dxa" w:w="1701"/>
-          </w:tcPr>
-          <w:p>
-            <w:pPr>
-              <w:jc w:val="center"/>
-            </w:pPr>
-            <w:r/>
-            <w:r>
-              <w:rPr>
-                <w:sz w:val="18"/>
-              </w:rPr>
-              <w:t>98,49</w:t>
-            </w:r>
-          </w:p>
-        </w:tc>
-        <w:tc>
-          <w:tcPr>
-            <w:tcW w:type="dxa" w:w="1814"/>
-          </w:tcPr>
-          <w:p>
-            <w:pPr>
-              <w:jc w:val="center"/>
-            </w:pPr>
-            <w:r/>
-            <w:r>
-              <w:rPr>
-                <w:sz w:val="18"/>
-              </w:rPr>
-              <w:t>98,28</w:t>
-            </w:r>
-          </w:p>
-        </w:tc>
-        <w:tc>
-          <w:tcPr>
-            <w:tcW w:type="dxa" w:w="1701"/>
-          </w:tcPr>
-          <w:p>
-            <w:pPr>
-              <w:jc w:val="center"/>
-            </w:pPr>
-            <w:r/>
-            <w:r>
-              <w:rPr>
-                <w:sz w:val="18"/>
-              </w:rPr>
-              <w:t>43,60</w:t>
-            </w:r>
-          </w:p>
-        </w:tc>
-        <w:tc>
-          <w:tcPr>
-            <w:tcW w:type="dxa" w:w="1701"/>
-          </w:tcPr>
-          <w:p>
-            <w:pPr>
-              <w:jc w:val="center"/>
-            </w:pPr>
-            <w:r/>
-            <w:r>
-              <w:rPr>
-                <w:sz w:val="18"/>
-              </w:rPr>
-              <w:t>18,33</w:t>
-            </w:r>
-          </w:p>
-        </w:tc>
-      </w:tr>
-      <w:tr>
-        <w:tc>
-          <w:tcPr>
-            <w:tcW w:type="dxa" w:w="1020"/>
-          </w:tcPr>
-          <w:p>
-            <w:pPr>
-              <w:jc w:val="left"/>
-            </w:pPr>
-            <w:r/>
-            <w:r>
-              <w:rPr>
-                <w:sz w:val="18"/>
-              </w:rPr>
-              <w:t>2025</w:t>
-            </w:r>
-          </w:p>
-        </w:tc>
-        <w:tc>
-          <w:tcPr>
-            <w:tcW w:type="dxa" w:w="1474"/>
-          </w:tcPr>
-          <w:p>
-            <w:pPr>
-              <w:jc w:val="center"/>
-            </w:pPr>
-            <w:r/>
-            <w:r>
-              <w:rPr>
-                <w:sz w:val="18"/>
-              </w:rPr>
-              <w:t>0,1219</w:t>
-            </w:r>
-          </w:p>
-        </w:tc>
-        <w:tc>
-          <w:tcPr>
-            <w:tcW w:type="dxa" w:w="1701"/>
-          </w:tcPr>
-          <w:p>
-            <w:pPr>
-              <w:jc w:val="center"/>
-            </w:pPr>
-            <w:r/>
-            <w:r>
-              <w:rPr>
-                <w:sz w:val="18"/>
-              </w:rPr>
-              <w:t>97,92</w:t>
-            </w:r>
-          </w:p>
-        </w:tc>
-        <w:tc>
-          <w:tcPr>
-            <w:tcW w:type="dxa" w:w="1814"/>
-          </w:tcPr>
-          <w:p>
-            <w:pPr>
-              <w:jc w:val="center"/>
-            </w:pPr>
-            <w:r/>
-            <w:r>
-              <w:rPr>
-                <w:sz w:val="18"/>
-              </w:rPr>
-              <w:t>98,12</w:t>
-            </w:r>
-          </w:p>
-        </w:tc>
-        <w:tc>
-          <w:tcPr>
-            <w:tcW w:type="dxa" w:w="1701"/>
-          </w:tcPr>
-          <w:p>
-            <w:pPr>
-              <w:jc w:val="center"/>
-            </w:pPr>
-            <w:r/>
-            <w:r>
-              <w:rPr>
-                <w:sz w:val="18"/>
-              </w:rPr>
-              <w:t>50,29</w:t>
-            </w:r>
-          </w:p>
-        </w:tc>
-        <w:tc>
-          <w:tcPr>
-            <w:tcW w:type="dxa" w:w="1701"/>
-          </w:tcPr>
-          <w:p>
-            <w:pPr>
-              <w:jc w:val="center"/>
-            </w:pPr>
-            <w:r/>
-            <w:r>
-              <w:rPr>
-                <w:sz w:val="18"/>
-              </w:rPr>
-              <w:t>18,26</w:t>
-            </w:r>
-          </w:p>
-        </w:tc>
-      </w:tr>
-    </w:tbl>
-    <w:p>
-      <w:pPr>
-        <w:spacing w:after="200"/>
-        <w:jc w:val="center"/>
-      </w:pPr>
-      <w:r>
-        <w:rPr>
-          <w:i/>
-          <w:sz w:val="18"/>
-        </w:rPr>
-        <w:t>Tabella 6. EEA+ Index e indicatori di qualità di prodotto a livello di Gruppo, 2023–2025 (indicatori di qualità: OR 7.5).</w:t>
-      </w:r>
-    </w:p>
-    <w:p>
-      <w:pPr>
-        <w:jc w:val="center"/>
-      </w:pPr>
-      <w:r>
-        <w:drawing>
-          <wp:inline xmlns:a="http://schemas.openxmlformats.org/drawingml/2006/main" xmlns:pic="http://schemas.openxmlformats.org/drawingml/2006/picture">
-            <wp:extent cx="5940000" cy="2145000"/>
-            <wp:docPr id="2" name="Picture 2"/>
-            <wp:cNvGraphicFramePr>
-              <a:graphicFrameLocks noChangeAspect="1"/>
-            </wp:cNvGraphicFramePr>
-            <a:graphic>
-              <a:graphicData uri="http://schemas.openxmlformats.org/drawingml/2006/picture">
-                <pic:pic>
-                  <pic:nvPicPr>
-                    <pic:cNvPr id="0" name="fig2.png"/>
-                    <pic:cNvPicPr/>
-                  </pic:nvPicPr>
-                  <pic:blipFill>
-                    <a:blip r:embed="rId19"/>
-                    <a:stretch>
-                      <a:fillRect/>
-                    </a:stretch>
-                  </pic:blipFill>
-                  <pic:spPr>
-                    <a:xfrm>
-                      <a:off x="0" y="0"/>
-                      <a:ext cx="5940000" cy="2145000"/>
-                    </a:xfrm>
-                    <a:prstGeom prst="rect"/>
-                  </pic:spPr>
-                </pic:pic>
-              </a:graphicData>
-            </a:graphic>
-          </wp:inline>
-        </w:drawing>
-      </w:r>
-    </w:p>
-    <w:p>
-      <w:pPr>
-        <w:spacing w:after="200"/>
-        <w:jc w:val="center"/>
-      </w:pPr>
-      <w:r>
-        <w:rPr>
-          <w:i/>
-          <w:sz w:val="18"/>
-        </w:rPr>
-        <w:t>Figura 2. Andamento a livello di Gruppo dell’EEA+ Index e degli indicatori di qualità, 2023–2025. Scale indipendenti per ciascun pannello.</w:t>
-      </w:r>
-    </w:p>
-    <w:p>
-      <w:pPr>
-        <w:pStyle w:val="3RELTestoBase"/>
-      </w:pPr>
-      <w:r>
-        <w:rPr>
-          <w:i w:val="0"/>
-        </w:rPr>
-        <w:t>Il quadro è meno lineare di quello che i soli indici di sostenibilità restituirebbero. Mentre l’EEA+I cresce di un terzo, la conformità normativa e la resa di prima scelta restano su livelli elevati ma flettono di alcuni decimi di punto, e la diffusione del declassamento sugli eventi produttivi sale dal 41,5 al 50,3 per cento con soglia all’1 per cento. La quota di episodi di maggiore intensità, letta con soglia al 5 per cento, cresce invece in misura contenuta, dal 16,8 al 18,3 per cento: l’aumento riguarda soprattutto declassamenti diffusi e di entità limitata. Per unità, la flessione del Right First Time si concentra su D020 nel 2025 (95,41 per cento), l’anno della sua riconversione a polo logistico, e su D060 (98,05 per cento), mentre D240 migliora (98,63 per cento).</w:t>
-      </w:r>
-    </w:p>
-    <w:p>
-      <w:pPr>
-        <w:pStyle w:val="3RELTestoBase"/>
-      </w:pPr>
-      <w:r>
-        <w:rPr>
-          <w:i w:val="0"/>
-        </w:rPr>
-        <w:t>Il risultato non contraddice il miglioramento della sostenibilità, ma ne precisa il perimetro: il beneficio termodinamico e multidimensionale misurato dall’EEA+ non si è tradotto, nello stesso periodo, in un miglioramento della qualità di prodotto. È esattamente il tipo di relazione che solo un sistema integrato rende visibile, e che il modello dell’OR 6.10 prevede di governare attraverso il termine di qualità della funzione di costo multi-obiettivo, accanto a quelli di produttività e di sostenibilità.</w:t>
-      </w:r>
-    </w:p>
-    <w:p>
-      <w:pPr>
-        <w:pStyle w:val="2RELSottotit"/>
-      </w:pPr>
-      <w:r>
-        <w:rPr>
-          <w:i w:val="0"/>
-        </w:rPr>
-        <w:t>3.6 Esiti della compliance analysis</w:t>
+        <w:t>3.5 Esiti della compliance analysis</w:t>
       </w:r>
     </w:p>
     <w:tbl>
@@ -4258,7 +3720,7 @@
               <w:rPr>
                 <w:sz w:val="18"/>
               </w:rPr>
-              <w:t>Tre unità produttive in esercizio; reparti ingegnerizzati (OR 7.6)</w:t>
+              <w:t>Tre unità produttive in esercizio nel periodo (D020 fino a luglio 2025); reparti ingegnerizzati (OR 7.6)</w:t>
             </w:r>
           </w:p>
         </w:tc>
@@ -4470,7 +3932,7 @@
               <w:rPr>
                 <w:sz w:val="18"/>
               </w:rPr>
-              <w:t>Vista integrata IIDS e interfacce in sola lettura per fabbrica, prodotto, lotto e Gruppo; lettura congiunta sostenibilità–qualità (§ 3.5)</w:t>
+              <w:t>Vista integrata IIDS e interfacce in sola lettura per fabbrica, prodotto, lotto e Gruppo</w:t>
             </w:r>
           </w:p>
         </w:tc>
@@ -4715,7 +4177,7 @@
           <w:i/>
           <w:sz w:val="18"/>
         </w:rPr>
-        <w:t>Tabella 7. Esiti della compliance analysis.</w:t>
+        <w:t>Tabella 6. Esiti della compliance analysis.</w:t>
       </w:r>
     </w:p>
     <w:p>
@@ -4737,7 +4199,7 @@
         <w:rPr>
           <w:i w:val="0"/>
         </w:rPr>
-        <w:t>3.7 Esiti della trade-off analysis</w:t>
+        <w:t>3.6 Esiti della trade-off analysis</w:t>
       </w:r>
     </w:p>
     <w:tbl>
@@ -4973,59 +4435,6 @@
           </w:p>
         </w:tc>
       </w:tr>
-      <w:tr>
-        <w:tc>
-          <w:tcPr>
-            <w:tcW w:type="dxa" w:w="2268"/>
-          </w:tcPr>
-          <w:p>
-            <w:pPr>
-              <w:jc w:val="left"/>
-            </w:pPr>
-            <w:r/>
-            <w:r>
-              <w:rPr>
-                <w:sz w:val="18"/>
-              </w:rPr>
-              <w:t>Sostenibilità e qualità</w:t>
-            </w:r>
-          </w:p>
-        </w:tc>
-        <w:tc>
-          <w:tcPr>
-            <w:tcW w:type="dxa" w:w="3855"/>
-          </w:tcPr>
-          <w:p>
-            <w:pPr>
-              <w:jc w:val="center"/>
-            </w:pPr>
-            <w:r/>
-            <w:r>
-              <w:rPr>
-                <w:sz w:val="18"/>
-              </w:rPr>
-              <w:t>EEA+I +34,1 % nel triennio; Defect Rate +8,8 punti, Right First Time −0,7 punti</w:t>
-            </w:r>
-          </w:p>
-        </w:tc>
-        <w:tc>
-          <w:tcPr>
-            <w:tcW w:type="dxa" w:w="3288"/>
-          </w:tcPr>
-          <w:p>
-            <w:pPr>
-              <w:jc w:val="center"/>
-            </w:pPr>
-            <w:r/>
-            <w:r>
-              <w:rPr>
-                <w:sz w:val="18"/>
-              </w:rPr>
-              <w:t>Il termine di qualità va mantenuto esplicito nella funzione di costo accanto a quello di sostenibilità</w:t>
-            </w:r>
-          </w:p>
-        </w:tc>
-      </w:tr>
     </w:tbl>
     <w:p>
       <w:pPr>
@@ -5037,7 +4446,7 @@
           <w:i/>
           <w:sz w:val="18"/>
         </w:rPr>
-        <w:t>Tabella 8. Esiti della trade-off analysis.</w:t>
+        <w:t>Tabella 7. Esiti della trade-off analysis.</w:t>
       </w:r>
     </w:p>
     <w:p>
@@ -5048,7 +4457,7 @@
         <w:rPr>
           <w:i w:val="0"/>
         </w:rPr>
-        <w:t>3.8 Verifica dei KPI di attività</w:t>
+        <w:t>3.7 Verifica dei KPI di attività</w:t>
       </w:r>
     </w:p>
     <w:tbl>
@@ -5232,7 +4641,7 @@
               <w:rPr>
                 <w:sz w:val="18"/>
               </w:rPr>
-              <w:t>Osservato per 36 mesi (2023–2025) su 3 unità: 9 valori annuali; TSI_rel di Gruppo 1,341</w:t>
+              <w:t>Osservato per 36 mesi (2023–2025) su 3 unità, D020 fino a luglio 2025: 9 valori annuali; TSI_rel di Gruppo 1,341</w:t>
             </w:r>
           </w:p>
         </w:tc>
@@ -5352,7 +4761,7 @@
           <w:i/>
           <w:sz w:val="18"/>
         </w:rPr>
-        <w:t>Tabella 9. Verifica dei KPI di attività.</w:t>
+        <w:t>Tabella 8. Verifica dei KPI di attività.</w:t>
       </w:r>
     </w:p>
     <w:p>
@@ -5396,7 +4805,7 @@
         <w:rPr>
           <w:i w:val="0"/>
         </w:rPr>
-        <w:t>Due risultati vanno oltre la semplice conferma. Il primo riguarda la composizione dell’indice di fabbrica: la crescita dell’EEA+I è dovuta per oltre quattro quinti allo score multidimensionale e per meno di un quinto all’efficienza exergetica. Il secondo riguarda la relazione fra sostenibilità e qualità: nel triennio in cui l’EEA+I cresce di un terzo, gli indicatori di qualità restano elevati ma non migliorano, e la diffusione del declassamento aumenta. Entrambi i risultati sono informazione decisionale che nessuno dei componenti, collaudato separatamente, avrebbe prodotto.</w:t>
+        <w:t>Un risultato va oltre la semplice conferma e riguarda la composizione dell’indice di fabbrica: la crescita dell’EEA+I è dovuta per oltre quattro quinti allo score multidimensionale e per meno di un quinto all’efficienza exergetica. È informazione decisionale che lo strumento, letto solo nel suo valore sintetico, non avrebbe restituito: indica che il beneficio accumulato sulle dimensioni ambientale, economica, sociale e tecnologica è oggi la componente prevalente del miglioramento, e che l’efficienza termodinamica di processo costituisce il margine su cui agire nelle fasi successive.</w:t>
       </w:r>
     </w:p>
     <w:p>
@@ -5418,7 +4827,7 @@
         <w:rPr>
           <w:i w:val="0"/>
         </w:rPr>
-        <w:t>Il Piano definisce la Intelligent Industry come l’interfacciamento dell’ambiente di fabbrica con quello direzionale. Il collaudo mostra in che cosa consista, in pratica, questo interfacciamento. Non si tratta di trasferire alla direzione più dati, ma di renderle leggibili sulla stessa base, con la stessa chiave di prodotto, di unità e di periodo, grandezze che nei sistemi di origine restano separate: exergia, contributi multidimensionali, conformità normativa, resa di cernita, rilievi del cliente. La lettura congiunta del § 3.5 è un esempio di ciò che questa base consente: rilevare che un miglioramento misurato in un dominio non si propaga all’altro, e attribuire il fenomeno all’unità e al periodo che lo generano.</w:t>
+        <w:t>Il Piano definisce la Intelligent Industry come l’interfacciamento dell’ambiente di fabbrica con quello direzionale. Il collaudo mostra in che cosa consista, in pratica, questo interfacciamento. Non si tratta di trasferire alla direzione più dati, ma di renderle leggibili sulla stessa base, con la stessa chiave di prodotto, di unità e di periodo, grandezze che nei sistemi di origine restano separate: exergia, contributi multidimensionali, prestazioni tecnologiche del prodotto, conformità normativa. La vista integrata consente di risalire da un indice di Gruppo all’unità, alla tipologia e al periodo che lo determinano, e di confrontare le alternative con pesi espliciti e sindacabili, come mostrato dalla trade-off analysis.</w:t>
       </w:r>
     </w:p>
     <w:p>
@@ -5429,7 +4838,7 @@
         <w:rPr>
           <w:i w:val="0"/>
         </w:rPr>
-        <w:t>La conseguenza operativa è diretta. Nella funzione di costo multi-obiettivo del modello dell’OR 6.10 i termini di produttività, qualità e sostenibilità sono pesati da coefficienti espliciti. Il collaudo indica che il termine di qualità non può essere trattato come un vincolo implicito, soddisfatto per default da un processo maturo: va monitorato con la stessa continuità dell’indice di sostenibilità e pesato in modo esplicito quando i due andamenti divergono.</w:t>
+        <w:t>La conseguenza operativa è diretta. Nella funzione di costo multi-obiettivo del modello dell’OR 6.10 i termini di produttività, qualità e sostenibilità sono pesati da coefficienti espliciti. Il collaudo mette a disposizione della direzione, per il termine di sostenibilità, due indici osservati nel tempo, riproducibili e stabili rispetto alle scelte di ponderazione: la condizione perché quel termine possa orientare le decisioni operative e non restare un esercizio di rendicontazione ex post.</w:t>
       </w:r>
     </w:p>
     <w:p>
@@ -5451,7 +4860,7 @@
         <w:rPr>
           <w:i w:val="0"/>
         </w:rPr>
-        <w:t>Il collaudo è condotto su serie annuali, che soddisfano e superano l’obiettivo di dodici mesi di osservazione ma non consentono di leggere la stagionalità né i transitori infra-annuali che il modello dell’OR 6.10, formulato in tempo discreto, è in grado di rappresentare. Le serie EEA+ 2023–2025 sono quelle provvisorie dell’OR 7.3, in corso di consolidamento; il consolidamento non modifica la struttura di calcolo e, per le regole di governo adottate, darà luogo a nuovi set di coefficienti versionati, mai a una modifica di quelli approvati. L’efficienza exergetica Ψ è impiegata come dato riportato dall’OR 7.3; la derivazione dell’exergia utile dai dati di processo è un elemento da consolidare. Il P-TSI dispone di due periodi di osservazione, il minimo per calcolare il TII.</w:t>
+        <w:t>Il collaudo è condotto su serie annuali, che soddisfano e superano l’obiettivo di dodici mesi di osservazione ma non consentono di leggere la stagionalità né i transitori infra-annuali che il modello dell’OR 6.10, formulato in tempo discreto, è in grado di rappresentare. Le serie EEA+ 2023–2025 sono quelle provvisorie dell’OR 7.3, in corso di consolidamento; il consolidamento non modifica la struttura di calcolo e, per le regole di governo adottate, darà luogo a nuovi set di coefficienti versionati, mai a una modifica di quelli approvati. L’efficienza exergetica Ψ è impiegata come dato riportato dall’OR 7.3; la derivazione dell’exergia utile dai dati di processo è un elemento da consolidare. Il P-TSI dispone di due periodi di osservazione, il minimo per calcolare il TII. Per l’unità D020 il 2025 è un anno di esercizio parziale, concluso nel luglio 2025 con la cessazione delle attività per la riconversione a polo logistico.</w:t>
       </w:r>
     </w:p>
     <w:p>
@@ -5517,7 +4926,7 @@
         <w:rPr>
           <w:i w:val="0"/>
         </w:rPr>
-        <w:t>Rispetto alle finalità del Piano di Sviluppo, il collaudo documenta in termini misurati tre delle azioni previste: l’impiego dell’intelligenza artificiale e dei dati per ottimizzare l’uso delle risorse energetiche e naturali, con una riduzione del 5,8 per cento dell’exergia di riferimento del Gruppo e un aumento dell’efficienza exergetica in tutte le unità; l’adozione di criteri di eco-efficacia per rispondere alla domanda di prodotti più sostenibili, con il miglioramento del P-TSI su tutte le tipologie; la costruzione di un’organizzazione più resiliente e competitiva, dotata degli strumenti per riconoscere i compromessi fra obiettivi prima che si traducano in perdite. È in questo passaggio, dalla trasformazione digitale dei processi alla capacità dell’organizzazione di governarne gli effetti, che la transizione da Industry 4.0 a Intelligent Industry assume un contenuto verificabile.</w:t>
+        <w:t>Rispetto alle finalità del Piano di Sviluppo, il collaudo documenta in termini misurati tre delle azioni previste: l’impiego dell’intelligenza artificiale e dei dati per ottimizzare l’uso delle risorse energetiche e naturali, con una riduzione dell’exergia di riferimento compresa fra il 5,3 e il 6,1 per cento nelle unità con esercizio completo e un aumento dell’efficienza exergetica in tutte le unità; l’adozione di criteri di eco-efficacia per rispondere alla domanda di prodotti più sostenibili, con il miglioramento del P-TSI su tutte le tipologie; la costruzione di un’organizzazione più resiliente e competitiva, dotata degli strumenti per leggere in modo integrato le prestazioni di fabbrica e di prodotto e per confrontare le alternative con criteri espliciti. È in questo passaggio, dalla trasformazione digitale dei processi alla capacità dell’organizzazione di governarne gli effetti, che la transizione da Industry 4.0 a Intelligent Industry assume un contenuto verificabile.</w:t>
       </w:r>
     </w:p>
     <w:p>
@@ -5539,7 +4948,7 @@
         <w:rPr>
           <w:i w:val="0"/>
         </w:rPr>
-        <w:t>L’attività ha conseguito il risultato atteso. La Intelligent Industry è stata collaudata in ambiente operativo sulle tre unità produttive del Gruppo: la catena di calcolo è riprodotta integralmente, i due KPI sono stati osservati oltre l’obiettivo dei dodici mesi e mostrano un miglioramento in tutte le unità e tipologie, la compliance analysis è superata su tutti i livelli. Il collaudo ha inoltre prodotto due acquisizioni non previste: la scomposizione del miglioramento dell’indice di fabbrica fra beneficio multidimensionale ed efficienza exergetica, e l’evidenza che il miglioramento della sostenibilità non si è accompagnato, nel periodo, a un miglioramento della qualità.</w:t>
+        <w:t>L’attività ha conseguito il risultato atteso. La Intelligent Industry è stata collaudata in ambiente operativo sulle tre unità produttive del Gruppo: la catena di calcolo è riprodotta integralmente, i due KPI sono stati osservati oltre l’obiettivo dei dodici mesi e mostrano un miglioramento in tutte le unità e tipologie, la compliance analysis è superata su tutti i livelli. Il collaudo ha inoltre prodotto due acquisizioni non previste: la scomposizione del miglioramento dell’indice di fabbrica fra beneficio multidimensionale ed efficienza exergetica, e la lettura temporale del P-TSI, che conferma nel tempo la diagnosi di prodotto dell’OR 7.4.</w:t>
       </w:r>
     </w:p>
     <w:p>
@@ -5550,7 +4959,7 @@
         <w:rPr>
           <w:i w:val="0"/>
         </w:rPr>
-        <w:t>Gli sviluppi individuati procedono in tre direzioni: il passaggio dall’osservazione annuale a quella mensile dei due indici, con alimentazione continua della vista integrata dalla piattaforma E2C; il consolidamento delle serie storiche e della derivazione dell’exergia utile; l’introduzione esplicita del termine di qualità nella lettura direzionale degli indici di sostenibilità, a partire dalle unità e dai formati in cui la divergenza fra i due andamenti è risultata più marcata.</w:t>
+        <w:t>Gli sviluppi individuati procedono in tre direzioni: il passaggio dall’osservazione annuale a quella mensile dei due indici, con alimentazione continua della vista integrata dalla piattaforma E2C; il consolidamento delle serie storiche e della derivazione dell’exergia utile; il rafforzamento dell’efficienza exergetica di processo, che il collaudo individua come la componente dell’indice di fabbrica con il maggiore margine di miglioramento.</w:t>
       </w:r>
     </w:p>
     <w:sectPr>

</xml_diff>

<commit_message>
RP 7.8: regenerate on RP 7.3 RV.2 values (log beta-1.3, ADR-015)
Merges the OR 7.3 branch (real D020 partial-year data, option A) and
regenerates RP 7.8 from the golden beta-1.3 log: Group TSI_abs 2025
0.1229, Group TSI_rel 1.3456, D020 2025 0.1212 / 1.398, per-plant
TSI_rel 1.322-1.398; D020 operated 1 Jan - 31 Jul 2025 with homologous
2022 reference. Sensitivity row updated to RV.2 (7 of 8 scenarios keep
D240 > D060 > D020). Adds the RP 7.3 RV.2 docx to the collection.

Co-Authored-By: Claude Opus 5.5 <noreply@anthropic.com>
Claude-Session: https://claude.ai/code/session_01T1dLZLyj2dv3qbNVGGafpd
</commit_message>
<xml_diff>
--- a/RP 7.8 Report di collaudo della Intelligent Industry.docx
+++ b/RP 7.8 Report di collaudo della Intelligent Industry.docx
@@ -543,7 +543,7 @@
         <w:rPr>
           <w:i w:val="0"/>
         </w:rPr>
-        <w:t>L’unità D020 ha operato come unità produttiva per una parte del 2025 e ha cessato le attività nel luglio 2025 per procedere alla riconversione a polo logistico. Il suo valore 2025 si riferisce quindi a un periodo di esercizio parziale. Poiché l’EEA+I è un indice intensivo, costruito come rapporto fra Sustainability Accounting ed exergia di riferimento e fra exergia utile ed exergia di riferimento, il valore resta confrontabile con quelli degli anni precedenti e delle altre unità. Le grandezze estensive di D020 per il 2025 (exergia di riferimento, contributi dei moduli) non sono invece confrontabili con quelle degli anni di esercizio completo e non sono impiegate nei confronti di variazione. Dal 2026 il perimetro produttivo del Gruppo comprende le unità D060 e D240.</w:t>
+        <w:t>L’unità D020 ha operato come unità produttiva dal 1° gennaio al 31 luglio 2025 e ha poi cessato le attività per procedere alla riconversione a polo logistico. Il suo valore 2025 si riferisce quindi a un periodo di esercizio parziale di sette mesi, trattato secondo la revisione RV.2 della RP 7.3: i contributi dei moduli sono calcolati rispetto a un riferimento omologo, il 2022 sulla stessa finestra gennaio–luglio, e non rispetto al 2022 annuale, così che la minore durata dell’esercizio non appaia come un miglioramento. I dati del periodo sono valori misurati. Poiché l’EEA+I è un indice intensivo, costruito come rapporto fra Sustainability Accounting ed exergia di riferimento e fra exergia utile ed exergia di riferimento, il valore resta confrontabile con quelli degli anni precedenti e delle altre unità. Le grandezze estensive di D020 per il 2025 (exergia di riferimento, contributi dei moduli) non sono invece confrontabili con quelle degli anni di esercizio completo e non sono impiegate nei confronti di variazione. Dal 2026 il perimetro produttivo del Gruppo comprende le unità D060 e D240.</w:t>
       </w:r>
     </w:p>
     <w:p>
@@ -933,7 +933,7 @@
         <w:rPr>
           <w:i w:val="0"/>
         </w:rPr>
-        <w:t>Il collaudo è eseguito nell’ambiente IIDS. La pipeline aggregata EEA+/TSI è alimentata dalla scheda di raccolta dati 2023–2025 dell’OR 7.3 (anagrafica e produzione delle unità, consumi di gas naturale ed energia elettrica, termini exergetici dei quattro moduli, libreria dei coefficienti, matrice AHP) e restituisce un registro di calcolo per unità, anno e variabile. Il registro è confrontato, valore per valore, con il registro di calcolo pubblicato con l’OR 7.3. Il set di coefficienti e il set di pesi impiegati sono stati approvati formalmente il 1° settembre 2026 e sono tracciati con identificativo e versione; ogni esecuzione registra il set utilizzato. L’intera base di codice è verificata da una suite di test automatici di unità, integrazione, regressione e contratto dati, eseguita a ogni modifica.</w:t>
+        <w:t>Il collaudo è eseguito nell’ambiente IIDS. La pipeline aggregata EEA+/TSI è alimentata dalla scheda di raccolta dati 2023–2025 dell’OR 7.3 (anagrafica e produzione delle unità, consumi di gas naturale ed energia elettrica, termini exergetici dei quattro moduli, libreria dei coefficienti, matrice AHP) e restituisce un registro di calcolo per unità, anno e variabile. Il registro è confrontato, valore per valore, con il registro di calcolo della RP 7.3 RV.2 (versione beta-1.3). Il set di coefficienti e il set di pesi impiegati sono stati approvati formalmente il 1° settembre 2026 e sono tracciati con identificativo e versione; ogni esecuzione registra il set utilizzato. L’intera base di codice è verificata da una suite di test automatici di unità, integrazione, regressione e contratto dati, eseguita a ogni modifica.</w:t>
       </w:r>
     </w:p>
     <w:p>
@@ -977,7 +977,7 @@
         <w:rPr>
           <w:i w:val="0"/>
         </w:rPr>
-        <w:t>La pipeline EEA+ eseguita nell’ambiente IIDS ha riprodotto tutti i 93 valori del registro di calcolo dell’OR 7.3, per le tre unità e i tre anni (Tabella 2). I contributi dei moduli, la Sustainability Accounting grezza, l’exergia di riferimento e l’efficienza Ψ coincidono esattamente; gli scarti residui su SA_w, Φ, TSI_abs e TSI_rel sono interamente attribuibili all’arrotondamento a quattro decimali dei pesi AHP e dei valori pubblicati, e il massimo, su Φ, è pari a 0,22 per cento. La suite di test dell’ambiente IIDS si è conclusa con 181 test superati e uno saltato per un elemento di formula in attesa di conferma documentato, senza esiti negativi.</w:t>
+        <w:t>La pipeline EEA+ eseguita nell’ambiente IIDS ha riprodotto tutti i 93 valori del registro di calcolo beta-1.3 della RP 7.3 RV.2, per le tre unità e i tre anni (Tabella 2). I contributi dei moduli, la Sustainability Accounting grezza, l’exergia di riferimento e l’efficienza Ψ coincidono esattamente; gli scarti residui su SA_w, Φ, TSI_abs e TSI_rel sono interamente attribuibili all’arrotondamento a quattro decimali dei pesi AHP e dei valori pubblicati, e il massimo, su Φ, è pari a 0,22 per cento. La suite di test dell’ambiente IIDS si è conclusa con 191 test superati e uno saltato per un elemento di formula in attesa di conferma documentato, senza esiti negativi.</w:t>
       </w:r>
     </w:p>
     <w:tbl>
@@ -1683,7 +1683,7 @@
               <w:rPr>
                 <w:sz w:val="18"/>
               </w:rPr>
-              <w:t>0,005 %</w:t>
+              <w:t>0,021 %</w:t>
             </w:r>
           </w:p>
         </w:tc>
@@ -1786,7 +1786,7 @@
           <w:i/>
           <w:sz w:val="18"/>
         </w:rPr>
-        <w:t>Tabella 2. Riproduzione del registro di calcolo OR 7.3 nell’ambiente IIDS.</w:t>
+        <w:t>Tabella 2. Riproduzione del registro di calcolo RP 7.3 RV.2 (beta-1.3) nell’ambiente IIDS.</w:t>
       </w:r>
     </w:p>
     <w:p>
@@ -1808,7 +1808,7 @@
         <w:rPr>
           <w:i w:val="0"/>
         </w:rPr>
-        <w:t>L’EEA+I cresce in tutte le unità e in tutti gli anni della serie (Tabella 3, Figura 1). Il valore di Gruppo, media ponderata sulla produzione, passa da 0,0909 nel 2023 a 0,1060 nel 2024 e a 0,1219 nel 2025, con un incremento del 16,6 per cento nel primo anno e del 15,0 per cento nel secondo; la lettura relativa TSI_rel di Gruppo è pari a 1,341. Il passo di crescita rallenta leggermente in tutte le unità fra il primo e il secondo intervallo, segno che il miglioramento procede con regolarità ma non accelera.</w:t>
+        <w:t>L’EEA+I cresce in tutte le unità e in tutti gli anni della serie (Tabella 3, Figura 1). Il valore di Gruppo, media ponderata sulla produzione, passa da 0,0909 nel 2023 a 0,1060 nel 2024 e a 0,1229 nel 2025, con un incremento del 16,6 per cento nel primo anno e del 15,9 per cento nel secondo; il TSI_rel di Gruppo è pari a 1,3456 (+34,6 per cento). Nelle unità con esercizio completo, D060 e D240, il passo di crescita rallenta leggermente fra il primo e il secondo intervallo. D020, osservata nel 2025 sul solo periodo gennaio–luglio, registra il miglioramento relativo più alto (TSI_rel 1,398). Per unità, TSI_rel è compreso fra 1,322 e 1,398.</w:t>
       </w:r>
     </w:p>
     <w:tbl>
@@ -2034,7 +2034,7 @@
               <w:rPr>
                 <w:sz w:val="18"/>
               </w:rPr>
-              <w:t>0,1180</w:t>
+              <w:t>0,1212</w:t>
             </w:r>
           </w:p>
         </w:tc>
@@ -2068,7 +2068,7 @@
               <w:rPr>
                 <w:sz w:val="18"/>
               </w:rPr>
-              <w:t>+15,8 %</w:t>
+              <w:t>+18,8 %</w:t>
             </w:r>
           </w:p>
         </w:tc>
@@ -2085,7 +2085,7 @@
               <w:rPr>
                 <w:sz w:val="18"/>
               </w:rPr>
-              <w:t>1,362</w:t>
+              <w:t>1,398</w:t>
             </w:r>
           </w:p>
         </w:tc>
@@ -2397,7 +2397,7 @@
               <w:rPr>
                 <w:sz w:val="18"/>
               </w:rPr>
-              <w:t>0,1219</w:t>
+              <w:t>0,1229</w:t>
             </w:r>
           </w:p>
         </w:tc>
@@ -2431,7 +2431,7 @@
               <w:rPr>
                 <w:sz w:val="18"/>
               </w:rPr>
-              <w:t>+15,0 %</w:t>
+              <w:t>+15,9 %</w:t>
             </w:r>
           </w:p>
         </w:tc>
@@ -2448,7 +2448,7 @@
               <w:rPr>
                 <w:sz w:val="18"/>
               </w:rPr>
-              <w:t>1,341</w:t>
+              <w:t>1,346</w:t>
             </w:r>
           </w:p>
         </w:tc>
@@ -2464,7 +2464,7 @@
           <w:i/>
           <w:sz w:val="18"/>
         </w:rPr>
-        <w:t>Tabella 3. EEA+ Index (TSI_abs) per unità e anno, variazioni annuali e lettura relativa. Gruppo: media ponderata sulla produzione.</w:t>
+        <w:t>Tabella 3. EEA+ Index (TSI_abs) per unità e anno, variazioni annuali e lettura relativa (RP 7.3 RV.2). Gruppo: media ponderata sulla produzione dell’anno; TSI_rel di Gruppo: media dei TSI_rel di unità ponderata sulla produzione 2025. D020 2025: periodo gennaio–luglio.</w:t>
       </w:r>
     </w:p>
     <w:p>
@@ -2549,7 +2549,7 @@
         <w:rPr>
           <w:i w:val="0"/>
         </w:rPr>
-        <w:t>La scomposizione di TSI_abs nelle sue due componenti mostra da dove proviene il miglioramento (Tabella 4). L’efficienza exergetica Ψ cresce in modo regolare, di circa un punto percentuale in due anni in ciascuna unità; l’exergia di riferimento scende fra il 2023 e il 2025 del 6,1 per cento in D060 e del 5,3 per cento in D240, le due unità con esercizio completo nell’intero periodo. Lo score multidimensionale Φ cresce invece da 0,019 a circa 0,072 e spiega fra l’84 e l’87 per cento dell’incremento di TSI_abs nelle tre unità.</w:t>
+        <w:t>La scomposizione di TSI_abs nelle sue due componenti mostra da dove proviene il miglioramento (Tabella 4). L’efficienza exergetica Ψ cresce in modo regolare, di circa un punto percentuale in due anni in ciascuna unità; l’exergia di riferimento scende fra il 2023 e il 2025 del 6,1 per cento in D060 e del 5,3 per cento in D240, le due unità con esercizio completo nell’intero periodo. Lo score multidimensionale Φ cresce invece da 0,019 a valori compresi fra 0,072 e 0,078 e spiega fra l’84 e l’87 per cento dell’incremento di TSI_abs nelle tre unità.</w:t>
       </w:r>
     </w:p>
     <w:tbl>
@@ -2758,7 +2758,7 @@
               <w:rPr>
                 <w:sz w:val="18"/>
               </w:rPr>
-              <w:t>0,0720</w:t>
+              <w:t>0,0784</w:t>
             </w:r>
           </w:p>
         </w:tc>
@@ -2826,7 +2826,7 @@
               <w:rPr>
                 <w:sz w:val="18"/>
               </w:rPr>
-              <w:t>84,0 %</w:t>
+              <w:t>85,5 %</w:t>
             </w:r>
           </w:p>
         </w:tc>
@@ -3094,7 +3094,7 @@
           <w:i/>
           <w:sz w:val="16"/>
         </w:rPr>
-        <w:t>¹ Non confrontabile: nel 2025 l’unità D020 ha operato fino a luglio (§ 1.3).</w:t>
+        <w:t>¹ Non confrontabile: nel 2025 l’unità D020 ha operato dal 1° gennaio al 31 luglio (§ 1.3); Ex_ref 2025 = 114.990 GJ riferito alla sola finestra di esercizio.</w:t>
       </w:r>
     </w:p>
     <w:p>
@@ -3105,7 +3105,7 @@
         <w:rPr>
           <w:i w:val="0"/>
         </w:rPr>
-        <w:t>Il dato va letto alla luce della costruzione dell’indice. I contributi dei moduli sono differenze rispetto al 2022, per cui Φ misura il beneficio multidimensionale accumulato dall’anno di riferimento e cresce per costruzione finché il miglioramento prosegue. Ψ misura invece lo stato dell’efficienza termodinamica nell’anno. La distinzione è rilevante per l’uso direzionale dell’indice: la crescita di TSI_abs segnala soprattutto il consolidarsi dei benefici ambientali, economici, sociali e tecnologici, mentre il miglioramento dell’efficienza exergetica di processo, pur costante, è di entità più contenuta.</w:t>
+        <w:t>Il dato va letto alla luce della costruzione dell’indice. I contributi dei moduli sono differenze rispetto al 2022 (per D020 nel 2025, rispetto al 2022 sulla stessa finestra), per cui Φ misura il beneficio multidimensionale accumulato dall’anno di riferimento e cresce per costruzione finché il miglioramento prosegue. Ψ misura invece lo stato dell’efficienza termodinamica nell’anno. La distinzione è rilevante per l’uso direzionale dell’indice: la crescita di TSI_abs segnala soprattutto il consolidarsi dei benefici ambientali, economici, sociali e tecnologici, mentre il miglioramento dell’efficienza exergetica di processo, pur costante, è di entità più contenuta.</w:t>
       </w:r>
     </w:p>
     <w:p>
@@ -4038,7 +4038,7 @@
               <w:rPr>
                 <w:sz w:val="18"/>
               </w:rPr>
-              <w:t>93 valori su 93 riprodotti; 181 test superati</w:t>
+              <w:t>93 valori su 93 riprodotti; 191 test superati</w:t>
             </w:r>
           </w:p>
         </w:tc>
@@ -4307,7 +4307,7 @@
               <w:rPr>
                 <w:sz w:val="18"/>
               </w:rPr>
-              <w:t>TSI_rel resta &gt; 1 in tutti gli scenari (1,237–1,486) e l’ordinamento D240 &gt; D060 &gt; D020 è invariato (OR 7.3)</w:t>
+              <w:t>TSI_rel resta &gt; 1 in tutti gli scenari (1,237–1,539); D240 è prima in tutti, e l’ordinamento D240 &gt; D060 &gt; D020 vale in 7 scenari su 8: nel focus multidimensionale (α = 0,6) D020 supera D060 (RP 7.3 RV.2)</w:t>
             </w:r>
           </w:p>
         </w:tc>
@@ -4324,7 +4324,7 @@
               <w:rPr>
                 <w:sz w:val="18"/>
               </w:rPr>
-              <w:t>Segno del miglioramento e gerarchia fra unità indipendenti dalla ponderazione</w:t>
+              <w:t>Segno del miglioramento indipendente dalla ponderazione; la posizione relativa di D060 e D020 dipende dal peso dato allo score multidimensionale</w:t>
             </w:r>
           </w:p>
         </w:tc>
@@ -4641,7 +4641,7 @@
               <w:rPr>
                 <w:sz w:val="18"/>
               </w:rPr>
-              <w:t>Osservato per 36 mesi (2023–2025) su 3 unità, D020 fino a luglio 2025: 9 valori annuali; TSI_rel di Gruppo 1,341</w:t>
+              <w:t>Osservato per 36 mesi (2023–2025) su 3 unità, D020 fino al 31 luglio 2025: 9 valori; TSI_rel di Gruppo 1,3456</w:t>
             </w:r>
           </w:p>
         </w:tc>
@@ -4860,7 +4860,7 @@
         <w:rPr>
           <w:i w:val="0"/>
         </w:rPr>
-        <w:t>Il collaudo è condotto su serie annuali, che soddisfano e superano l’obiettivo di dodici mesi di osservazione ma non consentono di leggere la stagionalità né i transitori infra-annuali che il modello dell’OR 6.10, formulato in tempo discreto, è in grado di rappresentare. Le serie EEA+ 2023–2025 sono quelle provvisorie dell’OR 7.3, in corso di consolidamento; il consolidamento non modifica la struttura di calcolo e, per le regole di governo adottate, darà luogo a nuovi set di coefficienti versionati, mai a una modifica di quelli approvati. L’efficienza exergetica Ψ è impiegata come dato riportato dall’OR 7.3; la derivazione dell’exergia utile dai dati di processo è un elemento da consolidare. Il P-TSI dispone di due periodi di osservazione, il minimo per calcolare il TII. Per l’unità D020 il 2025 è un anno di esercizio parziale, concluso nel luglio 2025 con la cessazione delle attività per la riconversione a polo logistico.</w:t>
+        <w:t>Il collaudo è condotto su serie annuali, che soddisfano e superano l’obiettivo di dodici mesi di osservazione ma non consentono di leggere la stagionalità né i transitori infra-annuali che il modello dell’OR 6.10, formulato in tempo discreto, è in grado di rappresentare. Le serie EEA+ 2023–2025 sono quelle della RP 7.3 RV.2 (registro beta-1.3), consolidate per D020 con i dati reali del periodo di esercizio 2025; un’ulteriore riconsolidazione non modificherebbe la struttura di calcolo e, per le regole di governo adottate, darebbe luogo a nuovi set di coefficienti versionati, mai a una modifica di quelli approvati. L’efficienza exergetica Ψ è impiegata come dato riportato dall’OR 7.3; la derivazione dell’exergia utile dai dati di processo è un elemento da consolidare. Il P-TSI dispone di due periodi di osservazione, il minimo per calcolare il TII. Per l’unità D020 il 2025 è un anno di esercizio parziale, concluso il 31 luglio 2025 con la cessazione delle attività per la riconversione a polo logistico: le sue grandezze estensive del 2025 non sono confrontabili con quelle degli anni pieni.</w:t>
       </w:r>
     </w:p>
     <w:p>

</xml_diff>

<commit_message>
RP 7.8: fix overlapping end labels in Figura 1, add comments to Tabelle 7 and 8
Co-Authored-By: Claude Opus 5.5 <noreply@anthropic.com>
Claude-Session: https://claude.ai/code/session_01T1dLZLyj2dv3qbNVGGafpd
</commit_message>
<xml_diff>
--- a/RP 7.8 Report di collaudo della Intelligent Industry.docx
+++ b/RP 7.8 Report di collaudo della Intelligent Industry.docx
@@ -4451,6 +4451,28 @@
     </w:p>
     <w:p>
       <w:pPr>
+        <w:pStyle w:val="3RELTestoBase"/>
+      </w:pPr>
+      <w:r>
+        <w:rPr>
+          <w:i w:val="0"/>
+        </w:rPr>
+        <w:t>La trade-off analysis restituisce un risultato coerente nei tre confronti: il sistema non nasconde i compromessi fra obiettivi, ma li rende espliciti e attribuibili a una scelta di ponderazione dichiarata. Sul versante della fabbrica, il bilanciamento α/β e la ponderazione AHP dell’EEA+ non modificano il segno del miglioramento: TSI_rel resta superiore all’unità in tutti gli scenari e D240 si conferma l’unità con l’indice più alto. L’unico elemento sensibile alle ipotesi è la posizione relativa di D060 e D020, che si invertono quando si assegna un peso maggiore allo score multidimensionale Φ, la componente su cui D020 registra nel 2025 il valore più elevato. La gerarchia fra le unità va quindi letta sempre insieme al peso attribuito alle due componenti dell’indice.</w:t>
+      </w:r>
+    </w:p>
+    <w:p>
+      <w:pPr>
+        <w:pStyle w:val="3RELTestoBase"/>
+      </w:pPr>
+      <w:r>
+        <w:rPr>
+          <w:i w:val="0"/>
+        </w:rPr>
+        <w:t>Sul versante del prodotto, il P-TSA mostra che indicare la tipologia «più sostenibile» richiede di esplicitare una priorità strategica: T3 prevale quando contano soprattutto disponibilità e qualità tecnica, T1 quando conta l’efficienza operativa. Robusta in ogni scenario è invece la posizione di T2, che resta la priorità di intervento del portafoglio. Il confronto fra resa volumetrica e diffusione del declassamento (OR 7.5) distingue infine due profili produttivi che il solo indicatore di resa non separerebbe, e che richiedono azioni di natura diversa. Nei tre casi il valore del sistema non consiste nell’eliminare il compromesso, ma nel portarlo a livello direzionale con criteri espliciti e sindacabili, come previsto dalla funzione di costo multi-obiettivo del modello dell’OR 6.10.</w:t>
+      </w:r>
+    </w:p>
+    <w:p>
+      <w:pPr>
         <w:pStyle w:val="2RELSottotit"/>
       </w:pPr>
       <w:r>
@@ -4762,6 +4784,28 @@
           <w:sz w:val="18"/>
         </w:rPr>
         <w:t>Tabella 8. Verifica dei KPI di attività.</w:t>
+      </w:r>
+    </w:p>
+    <w:p>
+      <w:pPr>
+        <w:pStyle w:val="3RELTestoBase"/>
+      </w:pPr>
+      <w:r>
+        <w:rPr>
+          <w:i w:val="0"/>
+        </w:rPr>
+        <w:t>Entrambi i KPI di attività risultano conseguiti, con un periodo di osservazione superiore all’obiettivo del Piano. L’EEA+ Index è stato osservato per trentasei mesi sulle tre unità produttive, il triplo dei dodici richiesti. L’unità D020 è stata osservata fino al 31 luglio 2025, data di cessazione dell’attività produttiva, e il suo valore 2025 è calcolato sulla finestra di esercizio effettiva rispetto a un riferimento omologo. La baseline, costituita dai risultati dell’OR 7.3, non è solo confermata ma estesa nel tempo: l’indice cresce in tutte le unità e in tutti gli anni della serie, con un TSI_rel di Gruppo pari a 1,3456. Il P-TSI è stato osservato su due periodi annuali consecutivi per le tre tipologie dell’OR 7.4, per complessivi ventiquattro mesi: il TII è positivo per tutte, compreso fra +3,2 e +9,8 per cento.</w:t>
+      </w:r>
+    </w:p>
+    <w:p>
+      <w:pPr>
+        <w:pStyle w:val="3RELTestoBase"/>
+      </w:pPr>
+      <w:r>
+        <w:rPr>
+          <w:i w:val="0"/>
+        </w:rPr>
+        <w:t>L’adozione di serie annuali complete ha reso superfluo il ricorso al buffer di ulteriori sei mesi previsto dal Piano a fronte del problema progettuale n. 8: ogni osservazione annuale copre da sola l’intero ciclo delle tipologie produttive per colore, formato e spessore. I due indici, sviluppati e collaudati separatamente negli OR 7.3 e 7.4, risultano così disponibili come serie temporali riproducibili, calcolate nell’ambiente integrato della Intelligent Industry con parametri approvati e versionati. È questa la condizione richiesta dal risultato finale RF 7: strumenti di assessment che, una volta in esercizio, producono misure coerenti nel tempo e utilizzabili per decidere.</w:t>
       </w:r>
     </w:p>
     <w:p>

</xml_diff>